<commit_message>
add crpd version of lab004 jnciesp roadmap
</commit_message>
<xml_diff>
--- a/jnciesproadmap/SYS-101/docs/SYS-101_SOLUTION-GUIDE.docx
+++ b/jnciesproadmap/SYS-101/docs/SYS-101_SOLUTION-GUIDE.docx
@@ -2525,7 +2525,7 @@
           <w:i w:val="0"/>
           <w:sz w:val="21"/>
         </w:rPr>
-        <w:t xml:space="preserve">S1 must receive notice messages and configuration changes through </w:t>
+        <w:t xml:space="preserve">s1 (172.31.1.100) must receive notice messages and configuration changes through </w:t>
       </w:r>
       <w:r>
         <w:rPr>
@@ -2667,6 +2667,7 @@
               <w:t xml:space="preserve">configure</w:t>
               <w:br/>
             </w:r>
+            <w:r/>
             <w:r>
               <w:rPr>
                 <w:rFonts w:ascii="Consolas" w:hAnsi="Consolas"/>
@@ -2674,7 +2675,150 @@
                 <w:sz w:val="17"/>
               </w:rPr>
               <w:t xml:space="preserve">set system syslog archive size 100k</w:t>
-              <w:br/>
+            </w:r>
+            <w:r/>
+          </w:p>
+          <w:p>
+            <w:pPr>
+              <w:pBdr/>
+              <w:spacing w:after="0"/>
+              <w:ind/>
+              <w:rPr/>
+            </w:pPr>
+            <w:r>
+              <w:rPr>
+                <w:rFonts w:ascii="Consolas" w:hAnsi="Consolas"/>
+                <w:color w:val="ffffff"/>
+                <w:sz w:val="17"/>
+              </w:rPr>
+              <w:t xml:space="preserve">set system syslog archive files 3</w:t>
+            </w:r>
+            <w:r/>
+          </w:p>
+          <w:p>
+            <w:pPr>
+              <w:pBdr/>
+              <w:spacing w:after="0"/>
+              <w:ind/>
+              <w:rPr/>
+            </w:pPr>
+            <w:r>
+              <w:rPr>
+                <w:rFonts w:ascii="Consolas" w:hAnsi="Consolas"/>
+                <w:color w:val="ffffff"/>
+                <w:sz w:val="17"/>
+              </w:rPr>
+              <w:t xml:space="preserve">set system syslog user ops any warning</w:t>
+            </w:r>
+            <w:r/>
+          </w:p>
+          <w:p>
+            <w:pPr>
+              <w:pBdr/>
+              <w:spacing w:after="0"/>
+              <w:ind/>
+              <w:rPr/>
+            </w:pPr>
+            <w:r>
+              <w:rPr>
+                <w:rFonts w:ascii="Consolas" w:hAnsi="Consolas"/>
+                <w:color w:val="ffffff"/>
+                <w:sz w:val="17"/>
+              </w:rPr>
+              <w:t xml:space="preserve">set system syslog host 172.31.1.100 any notice</w:t>
+            </w:r>
+            <w:r/>
+          </w:p>
+          <w:p>
+            <w:pPr>
+              <w:pBdr/>
+              <w:spacing w:after="0"/>
+              <w:ind/>
+              <w:rPr/>
+            </w:pPr>
+            <w:r>
+              <w:rPr>
+                <w:rFonts w:ascii="Consolas" w:hAnsi="Consolas"/>
+                <w:color w:val="ffffff"/>
+                <w:sz w:val="17"/>
+              </w:rPr>
+              <w:t xml:space="preserve">set system syslog host 172.31.1.100 change-log any</w:t>
+            </w:r>
+            <w:r/>
+          </w:p>
+          <w:p>
+            <w:pPr>
+              <w:pBdr/>
+              <w:spacing w:after="0"/>
+              <w:ind/>
+              <w:rPr/>
+            </w:pPr>
+            <w:r>
+              <w:rPr>
+                <w:rFonts w:ascii="Consolas" w:hAnsi="Consolas"/>
+                <w:color w:val="ffffff"/>
+                <w:sz w:val="17"/>
+              </w:rPr>
+              <w:t xml:space="preserve">set system syslog host 172.31.1.100 routing-instance mgmt_junos</w:t>
+            </w:r>
+            <w:r/>
+          </w:p>
+          <w:p>
+            <w:pPr>
+              <w:pBdr/>
+              <w:spacing w:after="0"/>
+              <w:ind/>
+              <w:rPr/>
+            </w:pPr>
+            <w:r>
+              <w:rPr>
+                <w:rFonts w:ascii="Consolas" w:hAnsi="Consolas"/>
+                <w:color w:val="ffffff"/>
+                <w:sz w:val="17"/>
+              </w:rPr>
+              <w:t xml:space="preserve">set system syslog file jncie-sp-messages any info</w:t>
+            </w:r>
+            <w:r/>
+          </w:p>
+          <w:p>
+            <w:pPr>
+              <w:pBdr/>
+              <w:spacing w:after="0"/>
+              <w:ind/>
+              <w:rPr/>
+            </w:pPr>
+            <w:r>
+              <w:rPr>
+                <w:rFonts w:ascii="Consolas" w:hAnsi="Consolas"/>
+                <w:color w:val="ffffff"/>
+                <w:sz w:val="17"/>
+              </w:rPr>
+              <w:t xml:space="preserve">set system syslog file jncie-sp-messages interactive-commands any</w:t>
+            </w:r>
+            <w:r/>
+          </w:p>
+          <w:p>
+            <w:pPr>
+              <w:pBdr/>
+              <w:spacing w:after="0"/>
+              <w:ind/>
+              <w:rPr/>
+            </w:pPr>
+            <w:r>
+              <w:rPr>
+                <w:rFonts w:ascii="Consolas" w:hAnsi="Consolas"/>
+                <w:color w:val="ffffff"/>
+                <w:sz w:val="17"/>
+              </w:rPr>
+              <w:t xml:space="preserve">set system syslog file user-commands interactive-commands any</w:t>
+            </w:r>
+            <w:r/>
+            <w:r>
+              <w:rPr>
+                <w:rFonts w:ascii="Consolas" w:hAnsi="Consolas"/>
+                <w:color w:val="ffffff"/>
+                <w:sz w:val="17"/>
+              </w:rPr>
             </w:r>
             <w:r>
               <w:rPr>
@@ -2682,70 +2826,6 @@
                 <w:color w:val="ffffff"/>
                 <w:sz w:val="17"/>
               </w:rPr>
-              <w:t xml:space="preserve">set system syslog archive files 3</w:t>
-              <w:br/>
-            </w:r>
-            <w:r>
-              <w:rPr>
-                <w:rFonts w:ascii="Consolas" w:hAnsi="Consolas"/>
-                <w:color w:val="ffffff"/>
-                <w:sz w:val="17"/>
-              </w:rPr>
-              <w:t xml:space="preserve">set system syslog file jncie-sp-messages any info</w:t>
-              <w:br/>
-            </w:r>
-            <w:r>
-              <w:rPr>
-                <w:rFonts w:ascii="Consolas" w:hAnsi="Consolas"/>
-                <w:color w:val="ffffff"/>
-                <w:sz w:val="17"/>
-              </w:rPr>
-              <w:t xml:space="preserve">set system syslog file jncie-sp-messages interactive-commands any</w:t>
-              <w:br/>
-            </w:r>
-            <w:r>
-              <w:rPr>
-                <w:rFonts w:ascii="Consolas" w:hAnsi="Consolas"/>
-                <w:color w:val="ffffff"/>
-                <w:sz w:val="17"/>
-              </w:rPr>
-              <w:t xml:space="preserve">set system syslog file user-commands interactive-commands any</w:t>
-              <w:br/>
-            </w:r>
-            <w:r>
-              <w:rPr>
-                <w:rFonts w:ascii="Consolas" w:hAnsi="Consolas"/>
-                <w:color w:val="ffffff"/>
-                <w:sz w:val="17"/>
-              </w:rPr>
-              <w:t xml:space="preserve">set system syslog host 172.31.1.100 any notice</w:t>
-              <w:br/>
-            </w:r>
-            <w:r>
-              <w:rPr>
-                <w:rFonts w:ascii="Consolas" w:hAnsi="Consolas"/>
-                <w:color w:val="ffffff"/>
-                <w:sz w:val="17"/>
-              </w:rPr>
-              <w:t xml:space="preserve">set system syslog host 172.31.1.100 change-log any</w:t>
-              <w:br/>
-            </w:r>
-            <w:r>
-              <w:rPr>
-                <w:rFonts w:ascii="Consolas" w:hAnsi="Consolas"/>
-                <w:color w:val="ffffff"/>
-                <w:sz w:val="17"/>
-              </w:rPr>
-              <w:t xml:space="preserve">set system syslog host 172.31.1.100 routing-instance mgmt_junos</w:t>
-              <w:br/>
-            </w:r>
-            <w:r>
-              <w:rPr>
-                <w:rFonts w:ascii="Consolas" w:hAnsi="Consolas"/>
-                <w:color w:val="ffffff"/>
-                <w:sz w:val="17"/>
-              </w:rPr>
-              <w:t xml:space="preserve">set system syslog user ops any warning</w:t>
               <w:br/>
             </w:r>
             <w:r>
@@ -2756,6 +2836,7 @@
               </w:rPr>
               <w:t xml:space="preserve">commit</w:t>
             </w:r>
+            <w:r/>
             <w:r/>
           </w:p>
         </w:tc>
@@ -3564,7 +3645,26 @@
           <w:i w:val="0"/>
           <w:sz w:val="21"/>
         </w:rPr>
-        <w:t xml:space="preserve">Use S1 as the DNS server through </w:t>
+        <w:t xml:space="preserve">Use S1 (</w:t>
+      </w:r>
+      <w:r>
+        <w:rPr>
+          <w:rFonts w:ascii="Aptos" w:hAnsi="Aptos"/>
+          <w:b/>
+          <w:bCs/>
+          <w:i w:val="0"/>
+          <w:sz w:val="21"/>
+        </w:rPr>
+        <w:t xml:space="preserve">172.31.1.100</w:t>
+      </w:r>
+      <w:r>
+        <w:rPr>
+          <w:rFonts w:ascii="Aptos" w:hAnsi="Aptos"/>
+          <w:b w:val="0"/>
+          <w:i w:val="0"/>
+          <w:sz w:val="21"/>
+        </w:rPr>
+        <w:t xml:space="preserve">) as the DNS server through </w:t>
       </w:r>
       <w:r>
         <w:rPr>
@@ -3658,7 +3758,7 @@
           <w:color w:val="9c0006"/>
           <w:sz w:val="20"/>
         </w:rPr>
-        <w:t xml:space="preserve">Europe/Amsterdam</w:t>
+        <w:t xml:space="preserve">Asia/Jakarta</w:t>
       </w:r>
       <w:r>
         <w:rPr>
@@ -3875,15 +3975,7 @@
           <w:highlight w:val="none"/>
         </w:rPr>
       </w:r>
-      <w:r>
-        <w:rPr>
-          <w:rFonts w:ascii="Aptos" w:hAnsi="Aptos"/>
-          <w:b w:val="0"/>
-          <w:i w:val="0"/>
-          <w:sz w:val="21"/>
-          <w:highlight w:val="none"/>
-        </w:rPr>
-      </w:r>
+      <w:r/>
     </w:p>
     <w:p>
       <w:pPr>
@@ -3928,7 +4020,6 @@
         </w:rPr>
         <w:t xml:space="preserve">. If an older address is returned, </w:t>
       </w:r>
-      <w:r/>
       <w:r>
         <w:rPr>
           <w:rFonts w:ascii="Aptos" w:hAnsi="Aptos"/>
@@ -3938,7 +4029,17 @@
         </w:rPr>
         <w:t xml:space="preserve">rebuild S1 without cache and redeploy it.</w:t>
       </w:r>
-      <w:r/>
+      <w:r>
+        <w:rPr>
+          <w:rFonts w:ascii="Aptos" w:hAnsi="Aptos"/>
+          <w:b w:val="0"/>
+          <w:bCs w:val="0"/>
+          <w:i w:val="0"/>
+          <w:sz w:val="21"/>
+          <w:szCs w:val="21"/>
+          <w:highlight w:val="none"/>
+        </w:rPr>
+      </w:r>
       <w:r>
         <w:rPr>
           <w:rFonts w:ascii="Aptos" w:hAnsi="Aptos"/>
@@ -4530,7 +4631,30 @@
           <w:i w:val="0"/>
           <w:sz w:val="21"/>
         </w:rPr>
-        <w:t xml:space="preserve">Wait for nonzero reach and </w:t>
+        <w:t xml:space="preserve">Wait for nonzero </w:t>
+      </w:r>
+      <w:r>
+        <w:rPr>
+          <w:rFonts w:ascii="Consolas" w:hAnsi="Consolas"/>
+          <w:b w:val="0"/>
+          <w:bCs w:val="0"/>
+          <w:i w:val="0"/>
+          <w:iCs w:val="0"/>
+          <w:color w:val="9c0006"/>
+          <w:sz w:val="20"/>
+          <w:szCs w:val="20"/>
+          <w:lang w:val="undefined"/>
+        </w:rPr>
+        <w:t xml:space="preserve">reach</w:t>
+      </w:r>
+      <w:r>
+        <w:rPr>
+          <w:rFonts w:ascii="Aptos" w:hAnsi="Aptos"/>
+          <w:b w:val="0"/>
+          <w:i w:val="0"/>
+          <w:sz w:val="21"/>
+        </w:rPr>
+        <w:t xml:space="preserve"> and </w:t>
       </w:r>
       <w:r>
         <w:rPr>
@@ -5017,15 +5141,7 @@
           <w:highlight w:val="none"/>
         </w:rPr>
       </w:r>
-      <w:r>
-        <w:rPr>
-          <w:rFonts w:ascii="Aptos" w:hAnsi="Aptos"/>
-          <w:b w:val="0"/>
-          <w:i w:val="0"/>
-          <w:sz w:val="21"/>
-          <w:highlight w:val="none"/>
-        </w:rPr>
-      </w:r>
+      <w:r/>
     </w:p>
     <w:p>
       <w:pPr>
@@ -5050,6 +5166,17 @@
           <w:sz w:val="21"/>
         </w:rPr>
         <w:t xml:space="preserve">Verify:</w:t>
+      </w:r>
+      <w:r>
+        <w:rPr>
+          <w:rFonts w:ascii="Aptos" w:hAnsi="Aptos"/>
+          <w:b w:val="0"/>
+          <w:bCs w:val="0"/>
+          <w:i w:val="0"/>
+          <w:sz w:val="21"/>
+          <w:szCs w:val="21"/>
+          <w:highlight w:val="none"/>
+        </w:rPr>
       </w:r>
       <w:r>
         <w:rPr>
@@ -5100,8 +5227,10 @@
         <w:rPr>
           <w:rFonts w:ascii="Aptos" w:hAnsi="Aptos"/>
           <w:b w:val="0"/>
+          <w:bCs w:val="0"/>
           <w:i w:val="0"/>
           <w:sz w:val="21"/>
+          <w:szCs w:val="21"/>
           <w:highlight w:val="none"/>
         </w:rPr>
       </w:r>
@@ -5136,7 +5265,12 @@
               <w:pBdr/>
               <w:spacing w:after="0"/>
               <w:ind/>
-              <w:rPr/>
+              <w:rPr>
+                <w:rFonts w:ascii="Consolas" w:hAnsi="Consolas"/>
+                <w:color w:val="ffffff"/>
+                <w:sz w:val="17"/>
+                <w:szCs w:val="17"/>
+              </w:rPr>
             </w:pPr>
             <w:r>
               <w:rPr>
@@ -5153,8 +5287,48 @@
                 <w:color w:val="ffffff"/>
                 <w:sz w:val="17"/>
               </w:rPr>
-              <w:t xml:space="preserve">show log messages | match transfer</w:t>
             </w:r>
+            <w:r>
+              <w:rPr>
+                <w:rFonts w:ascii="Consolas" w:hAnsi="Consolas"/>
+                <w:color w:val="ffffff"/>
+                <w:sz w:val="17"/>
+              </w:rPr>
+              <w:t xml:space="preserve">show log jncie-sp-messages | match transfer</w:t>
+            </w:r>
+            <w:r/>
+            <w:r>
+              <w:rPr>
+                <w:rFonts w:ascii="Consolas" w:hAnsi="Consolas"/>
+                <w:color w:val="ffffff"/>
+                <w:sz w:val="17"/>
+              </w:rPr>
+            </w:r>
+            <w:r/>
+          </w:p>
+          <w:p>
+            <w:pPr>
+              <w:pBdr/>
+              <w:spacing w:after="0"/>
+              <w:ind/>
+              <w:rPr/>
+            </w:pPr>
+            <w:r>
+              <w:rPr>
+                <w:rFonts w:ascii="Consolas" w:hAnsi="Consolas"/>
+                <w:color w:val="ffffff"/>
+                <w:sz w:val="17"/>
+              </w:rPr>
+            </w:r>
+            <w:r>
+              <w:rPr>
+                <w:rFonts w:ascii="Consolas" w:hAnsi="Consolas"/>
+                <w:color w:val="ffffff"/>
+                <w:sz w:val="17"/>
+              </w:rPr>
+              <w:t xml:space="preserve">show log jncie-sp-messages | match conf.gz</w:t>
+            </w:r>
+            <w:r/>
             <w:r/>
           </w:p>
         </w:tc>
@@ -5230,15 +5404,7 @@
           <w:highlight w:val="none"/>
         </w:rPr>
       </w:r>
-      <w:r>
-        <w:rPr>
-          <w:rFonts w:ascii="Aptos" w:hAnsi="Aptos"/>
-          <w:b w:val="0"/>
-          <w:i w:val="0"/>
-          <w:sz w:val="21"/>
-          <w:highlight w:val="none"/>
-        </w:rPr>
-      </w:r>
+      <w:r/>
     </w:p>
     <w:p>
       <w:pPr>
@@ -5284,6 +5450,17 @@
           <w:highlight w:val="none"/>
         </w:rPr>
       </w:r>
+      <w:r>
+        <w:rPr>
+          <w:rFonts w:ascii="Aptos" w:hAnsi="Aptos"/>
+          <w:b w:val="0"/>
+          <w:bCs w:val="0"/>
+          <w:i w:val="0"/>
+          <w:sz w:val="21"/>
+          <w:szCs w:val="21"/>
+          <w:highlight w:val="none"/>
+        </w:rPr>
+      </w:r>
     </w:p>
     <w:p>
       <w:pPr>
@@ -5322,8 +5499,10 @@
         <w:rPr>
           <w:rFonts w:ascii="Aptos" w:hAnsi="Aptos"/>
           <w:b w:val="0"/>
+          <w:bCs w:val="0"/>
           <w:i w:val="0"/>
           <w:sz w:val="21"/>
+          <w:szCs w:val="21"/>
           <w:highlight w:val="none"/>
         </w:rPr>
       </w:r>
@@ -6656,15 +6835,7 @@
           <w:highlight w:val="none"/>
         </w:rPr>
       </w:r>
-      <w:r>
-        <w:rPr>
-          <w:rFonts w:ascii="Aptos" w:hAnsi="Aptos"/>
-          <w:b w:val="0"/>
-          <w:i w:val="0"/>
-          <w:sz w:val="21"/>
-          <w:highlight w:val="none"/>
-        </w:rPr>
-      </w:r>
+      <w:r/>
     </w:p>
     <w:p>
       <w:pPr>
@@ -6756,8 +6927,17 @@
         </w:rPr>
         <w:t xml:space="preserve">terminal. Confirm the commit only after successful tests.</w:t>
       </w:r>
-      <w:r/>
-      <w:r/>
+      <w:r>
+        <w:rPr>
+          <w:rFonts w:ascii="Aptos" w:hAnsi="Aptos"/>
+          <w:b w:val="0"/>
+          <w:bCs w:val="0"/>
+          <w:i w:val="0"/>
+          <w:sz w:val="21"/>
+          <w:szCs w:val="21"/>
+          <w:highlight w:val="none"/>
+        </w:rPr>
+      </w:r>
     </w:p>
     <w:p>
       <w:pPr>
@@ -6784,15 +6964,7 @@
           <w:highlight w:val="none"/>
         </w:rPr>
       </w:r>
-      <w:r>
-        <w:rPr>
-          <w:rFonts w:ascii="Aptos" w:hAnsi="Aptos"/>
-          <w:b w:val="0"/>
-          <w:i w:val="0"/>
-          <w:sz w:val="21"/>
-          <w:highlight w:val="none"/>
-        </w:rPr>
-      </w:r>
+      <w:r/>
     </w:p>
     <w:p>
       <w:pPr>
@@ -6818,7 +6990,17 @@
         </w:rPr>
         <w:t xml:space="preserve">To prove local fallback, temporarily stop RADIUS without removing S1:</w:t>
       </w:r>
-      <w:r/>
+      <w:r>
+        <w:rPr>
+          <w:rFonts w:ascii="Aptos" w:hAnsi="Aptos"/>
+          <w:b w:val="0"/>
+          <w:bCs w:val="0"/>
+          <w:i w:val="0"/>
+          <w:sz w:val="21"/>
+          <w:szCs w:val="21"/>
+          <w:highlight w:val="none"/>
+        </w:rPr>
+      </w:r>
     </w:p>
     <w:tbl>
       <w:tblPr>

</xml_diff>

<commit_message>
modify some labs config
</commit_message>
<xml_diff>
--- a/jnciesproadmap/SYS-101/docs/SYS-101_SOLUTION-GUIDE.docx
+++ b/jnciesproadmap/SYS-101/docs/SYS-101_SOLUTION-GUIDE.docx
@@ -2855,6 +2855,49 @@
           <w:b w:val="0"/>
           <w:i w:val="0"/>
           <w:sz w:val="21"/>
+          <w:highlight w:val="none"/>
+        </w:rPr>
+      </w:r>
+      <w:r>
+        <w:rPr>
+          <w:rFonts w:ascii="Aptos" w:hAnsi="Aptos"/>
+          <w:b w:val="0"/>
+          <w:i w:val="0"/>
+          <w:sz w:val="21"/>
+          <w:highlight w:val="none"/>
+        </w:rPr>
+      </w:r>
+      <w:r>
+        <w:rPr>
+          <w:rFonts w:ascii="Aptos" w:hAnsi="Aptos"/>
+          <w:b w:val="0"/>
+          <w:i w:val="0"/>
+          <w:sz w:val="21"/>
+          <w:highlight w:val="none"/>
+        </w:rPr>
+      </w:r>
+    </w:p>
+    <w:p>
+      <w:pPr>
+        <w:pBdr/>
+        <w:spacing/>
+        <w:ind/>
+        <w:rPr>
+          <w:rFonts w:ascii="Aptos" w:hAnsi="Aptos"/>
+          <w:b w:val="0"/>
+          <w:bCs w:val="0"/>
+          <w:i w:val="0"/>
+          <w:sz w:val="21"/>
+          <w:szCs w:val="21"/>
+          <w:highlight w:val="none"/>
+        </w:rPr>
+      </w:pPr>
+      <w:r>
+        <w:rPr>
+          <w:rFonts w:ascii="Aptos" w:hAnsi="Aptos"/>
+          <w:b w:val="0"/>
+          <w:i w:val="0"/>
+          <w:sz w:val="21"/>
         </w:rPr>
         <w:t xml:space="preserve">The </w:t>
       </w:r>
@@ -4643,7 +4686,6 @@
           <w:color w:val="9c0006"/>
           <w:sz w:val="20"/>
           <w:szCs w:val="20"/>
-          <w:lang w:val="undefined"/>
         </w:rPr>
         <w:t xml:space="preserve">reach</w:t>
       </w:r>
@@ -4858,6 +4900,9 @@
           <w:numId w:val="14"/>
         </w:numPr>
         <w:pBdr/>
+        <w:tabs>
+          <w:tab w:val="clear" w:leader="none" w:pos="360"/>
+        </w:tabs>
         <w:spacing/>
         <w:ind/>
         <w:rPr/>
@@ -4869,7 +4914,30 @@
           <w:i w:val="0"/>
           <w:sz w:val="21"/>
         </w:rPr>
-        <w:t xml:space="preserve">Use S1 SCP with </w:t>
+        <w:t xml:space="preserve">Use S1 </w:t>
+      </w:r>
+      <w:r>
+        <w:rPr>
+          <w:rFonts w:ascii="Consolas" w:hAnsi="Consolas"/>
+          <w:b w:val="0"/>
+          <w:bCs w:val="0"/>
+          <w:i w:val="0"/>
+          <w:iCs w:val="0"/>
+          <w:color w:val="9c0006"/>
+          <w:sz w:val="20"/>
+          <w:szCs w:val="20"/>
+          <w:lang w:val="undefined"/>
+        </w:rPr>
+        <w:t xml:space="preserve">(172.31.1.100</w:t>
+      </w:r>
+      <w:r>
+        <w:rPr>
+          <w:rFonts w:ascii="Aptos" w:hAnsi="Aptos"/>
+          <w:b w:val="0"/>
+          <w:i w:val="0"/>
+          <w:sz w:val="21"/>
+        </w:rPr>
+        <w:t xml:space="preserve">) SCP with </w:t>
       </w:r>
       <w:r>
         <w:rPr>
@@ -4940,7 +5008,7 @@
           <w:color w:val="9c0006"/>
           <w:sz w:val="20"/>
         </w:rPr>
-        <w:t xml:space="preserve">/srv/ftp/archive</w:t>
+        <w:t xml:space="preserve">/tmp</w:t>
       </w:r>
       <w:r>
         <w:rPr>
@@ -5218,8 +5286,10 @@
         <w:rPr>
           <w:rFonts w:ascii="Aptos" w:hAnsi="Aptos"/>
           <w:b w:val="0"/>
+          <w:bCs w:val="0"/>
           <w:i w:val="0"/>
           <w:sz w:val="21"/>
+          <w:szCs w:val="21"/>
           <w:highlight w:val="none"/>
         </w:rPr>
       </w:r>
@@ -5287,6 +5357,7 @@
                 <w:color w:val="ffffff"/>
                 <w:sz w:val="17"/>
               </w:rPr>
+              <w:t xml:space="preserve">show log jncie-sp-messages | match transfer</w:t>
             </w:r>
             <w:r>
               <w:rPr>
@@ -5294,17 +5365,15 @@
                 <w:color w:val="ffffff"/>
                 <w:sz w:val="17"/>
               </w:rPr>
-              <w:t xml:space="preserve">show log jncie-sp-messages | match transfer</w:t>
             </w:r>
-            <w:r/>
             <w:r>
               <w:rPr>
                 <w:rFonts w:ascii="Consolas" w:hAnsi="Consolas"/>
                 <w:color w:val="ffffff"/>
                 <w:sz w:val="17"/>
+                <w:szCs w:val="17"/>
               </w:rPr>
             </w:r>
-            <w:r/>
           </w:p>
           <w:p>
             <w:pPr>
@@ -5328,7 +5397,6 @@
               </w:rPr>
               <w:t xml:space="preserve">show log jncie-sp-messages | match conf.gz</w:t>
             </w:r>
-            <w:r/>
             <w:r/>
           </w:p>
         </w:tc>
@@ -5490,8 +5558,10 @@
         <w:rPr>
           <w:rFonts w:ascii="Aptos" w:hAnsi="Aptos"/>
           <w:b w:val="0"/>
+          <w:bCs w:val="0"/>
           <w:i w:val="0"/>
           <w:sz w:val="21"/>
+          <w:szCs w:val="21"/>
           <w:highlight w:val="none"/>
         </w:rPr>
       </w:r>
@@ -6507,6 +6577,9 @@
           <w:numId w:val="16"/>
         </w:numPr>
         <w:pBdr/>
+        <w:tabs>
+          <w:tab w:val="clear" w:leader="none" w:pos="360"/>
+        </w:tabs>
         <w:spacing/>
         <w:ind/>
         <w:rPr/>
@@ -6518,7 +6591,30 @@
           <w:i w:val="0"/>
           <w:sz w:val="21"/>
         </w:rPr>
-        <w:t xml:space="preserve">Use S1 through </w:t>
+        <w:t xml:space="preserve">Use S1 (</w:t>
+      </w:r>
+      <w:r>
+        <w:rPr>
+          <w:rFonts w:ascii="Consolas" w:hAnsi="Consolas"/>
+          <w:b w:val="0"/>
+          <w:bCs w:val="0"/>
+          <w:i w:val="0"/>
+          <w:iCs w:val="0"/>
+          <w:color w:val="9c0006"/>
+          <w:sz w:val="20"/>
+          <w:szCs w:val="20"/>
+          <w:lang w:val="undefined"/>
+        </w:rPr>
+        <w:t xml:space="preserve">173.31.1.100</w:t>
+      </w:r>
+      <w:r>
+        <w:rPr>
+          <w:rFonts w:ascii="Aptos" w:hAnsi="Aptos"/>
+          <w:b w:val="0"/>
+          <w:i w:val="0"/>
+          <w:sz w:val="21"/>
+        </w:rPr>
+        <w:t xml:space="preserve">) through </w:t>
       </w:r>
       <w:r>
         <w:rPr>
@@ -6633,6 +6729,9 @@
           <w:numId w:val="16"/>
         </w:numPr>
         <w:pBdr/>
+        <w:tabs>
+          <w:tab w:val="clear" w:leader="none" w:pos="360"/>
+        </w:tabs>
         <w:spacing/>
         <w:ind/>
         <w:rPr/>
@@ -6644,7 +6743,53 @@
           <w:i w:val="0"/>
           <w:sz w:val="21"/>
         </w:rPr>
-        <w:t xml:space="preserve">Prove RADIUS authentication while S1 is available.</w:t>
+        <w:t xml:space="preserve">Prove RADIUS authentication while S1 is available (</w:t>
+      </w:r>
+      <w:r>
+        <w:rPr>
+          <w:rFonts w:ascii="Consolas" w:hAnsi="Consolas"/>
+          <w:b w:val="0"/>
+          <w:bCs w:val="0"/>
+          <w:i w:val="0"/>
+          <w:iCs w:val="0"/>
+          <w:color w:val="9c0006"/>
+          <w:sz w:val="20"/>
+          <w:szCs w:val="20"/>
+          <w:lang w:val="undefined"/>
+        </w:rPr>
+        <w:t xml:space="preserve">ops / ops123</w:t>
+      </w:r>
+      <w:r>
+        <w:rPr>
+          <w:rFonts w:ascii="Aptos" w:hAnsi="Aptos"/>
+          <w:b w:val="0"/>
+          <w:i w:val="0"/>
+          <w:sz w:val="21"/>
+        </w:rPr>
+        <w:t xml:space="preserve"> ; </w:t>
+      </w:r>
+      <w:r>
+        <w:rPr>
+          <w:rFonts w:ascii="Consolas" w:hAnsi="Consolas"/>
+          <w:b w:val="0"/>
+          <w:bCs w:val="0"/>
+          <w:i w:val="0"/>
+          <w:iCs w:val="0"/>
+          <w:color w:val="9c0006"/>
+          <w:sz w:val="20"/>
+          <w:szCs w:val="20"/>
+          <w:lang w:val="undefined"/>
+        </w:rPr>
+        <w:t xml:space="preserve">noc / noc123</w:t>
+      </w:r>
+      <w:r>
+        <w:rPr>
+          <w:rFonts w:ascii="Aptos" w:hAnsi="Aptos"/>
+          <w:b w:val="0"/>
+          <w:i w:val="0"/>
+          <w:sz w:val="21"/>
+        </w:rPr>
+        <w:t xml:space="preserve">).</w:t>
       </w:r>
       <w:r/>
     </w:p>
@@ -6938,6 +7083,17 @@
           <w:highlight w:val="none"/>
         </w:rPr>
       </w:r>
+      <w:r>
+        <w:rPr>
+          <w:rFonts w:ascii="Aptos" w:hAnsi="Aptos"/>
+          <w:b w:val="0"/>
+          <w:bCs w:val="0"/>
+          <w:i w:val="0"/>
+          <w:sz w:val="21"/>
+          <w:szCs w:val="21"/>
+          <w:highlight w:val="none"/>
+        </w:rPr>
+      </w:r>
     </w:p>
     <w:p>
       <w:pPr>
@@ -6989,6 +7145,17 @@
           <w:sz w:val="21"/>
         </w:rPr>
         <w:t xml:space="preserve">To prove local fallback, temporarily stop RADIUS without removing S1:</w:t>
+      </w:r>
+      <w:r>
+        <w:rPr>
+          <w:rFonts w:ascii="Aptos" w:hAnsi="Aptos"/>
+          <w:b w:val="0"/>
+          <w:bCs w:val="0"/>
+          <w:i w:val="0"/>
+          <w:sz w:val="21"/>
+          <w:szCs w:val="21"/>
+          <w:highlight w:val="none"/>
+        </w:rPr>
       </w:r>
       <w:r>
         <w:rPr>

</xml_diff>